<commit_message>
Let the parish office reach the rest of its own nav
The office nav was one flex row with overflow-x: auto and
scrollbar-width: none. Ten chips come to about 1390px; the column is
900px. Four of them sat past the right edge - Events, Visitor activity,
What people read and Archive - and hiding the scrollbar removed the one
clue that anything was there.

So the parish could not reach its content editor or its archive, and
nothing on screen explained why. Measured before and after rather than
eyeballed: 1390px of chips in a 900px container, four cut off; now
nothing cut off, two rows at 900px and five at 375px.

This was not only the chip I added last week. Content and Archive were
already past the edge at nine items; the tenth made it worse and made
it visible as a complaint.

Co-Authored-By: Claude Opus 5 <noreply@anthropic.com>
</commit_message>
<xml_diff>
--- a/docs/SanctiWalk-Capstone-Revised.docx
+++ b/docs/SanctiWalk-Capstone-Revised.docx
@@ -11,7 +11,7 @@
         <w:rPr>
           <w:b/>
         </w:rPr>
-        <w:t>SANCTIWALK: A MOBILE TOUR GUIDE AND PARISH INFORMATION SYSTEM FOR MARY HELP OF CHRISTIANS PARISH AND SAN ROQUE CATHEDRAL PARISH, DIOCESE OF KALOOKAN</w:t>
+        <w:t>SANCTIWALK: A MOBILE APP TOUR GUIDE SYSTEM FOR MARY HELP OF CHRISTIANS PARISH AND SAN ROQUE CATHEDRAL PARISH, DIOCESE OF KALOOKAN</w:t>
       </w:r>
     </w:p>
     <w:p>
@@ -34,7 +34,7 @@
           <w:i/>
           <w:color w:val="C00000"/>
         </w:rPr>
-        <w:t>[TO SUPPLY] The title has been widened from "Tour Guide System" to "Tour Guide and Parish Information System". The delivered system does substantially more than guide a tour: it carries the parish's schedules, announcements and sacramental services. If your panel has already approved the old title, keep the old one and ignore this change — the chapters below do not depend on it.</w:t>
+        <w:t>[TO SUPPLY] The approved title is kept exactly as it stands. An earlier draft of this revision widened it; that is reverted. The chapters below are written so that every module of the system is defensible as part of a tour guide — see "Why this is a tour guide system" in the Purpose, and the first entry of the appendix.</w:t>
       </w:r>
     </w:p>
     <w:p>
@@ -99,7 +99,45 @@
         <w:ind w:firstLine="720"/>
       </w:pPr>
       <w:r>
-        <w:t>The parishes face a parallel difficulty in the opposite direction. Both receive a continuous flow of requests from parishioners: applications to join lay ministries, and bookings for sacraments such as baptism, confirmation and matrimony. These are handled manually. A parishioner presents themselves at the parish office, the details are written down and filed, and the record of what was requested and what was decided exists on paper in that office. The applicant has no means of checking the progress of their request other than returning in person or telephoning, and the office has no consolidated view of what is outstanding, what has been approved, and what remains to be acted upon.</w:t>
+        <w:t>The parish offices face a difficulty of their own. Both receive a continuous flow of requests from parishioners: applications to join lay ministries, and bookings for sacraments such as baptism, confirmation and matrimony. These are handled manually. A parishioner presents themselves at the parish office, the details are written down and filed, and the record of what was requested and what was decided exists on paper in that office. The applicant has no means of checking the progress of their request other than returning in person or telephoning, and the office has no consolidated view of what is outstanding, what has been approved, and what remains to be acted upon.</w:t>
+      </w:r>
+    </w:p>
+    <w:p>
+      <w:pPr>
+        <w:pStyle w:val="Heading3"/>
+        <w:spacing w:before="240" w:after="120"/>
+      </w:pPr>
+      <w:r>
+        <w:rPr>
+          <w:rFonts w:ascii="Times New Roman" w:hAnsi="Times New Roman"/>
+          <w:color w:val="000000"/>
+          <w:sz w:val="24"/>
+        </w:rPr>
+        <w:t>The partnership behind the content</w:t>
+      </w:r>
+    </w:p>
+    <w:p>
+      <w:pPr>
+        <w:ind w:firstLine="720"/>
+      </w:pPr>
+      <w:r>
+        <w:t>The study was undertaken with the Diocese of Kalookan rather than about it. The proponents worked with Rev. Fr. Paul Nicklaus Woo, Director of Cultural Heritage of the Diocese of Kalookan, and with the writer of AGOS, the diocese's own account of the history of its parishes and communities across Caloocan, Malabon and Navotas.</w:t>
+      </w:r>
+    </w:p>
+    <w:p>
+      <w:pPr>
+        <w:ind w:firstLine="720"/>
+      </w:pPr>
+      <w:r>
+        <w:t>This partnership is the reason the study can claim its heritage content is accurate rather than merely collected. Every station description, every parish history and every account of a sacred object in the system comes from, or was confirmed against, the diocese's own historical record and the office responsible for it. A guide that misidentifies an image or misstates the founding of a church misinforms the visitor and misrepresents the heritage it exists to present. The system therefore displays only content supplied or verified by the parish. Where information has not yet been collected, it presents an explicit statement to that effect and directs the visitor to the parish office, rather than showing an empty screen or substituting a description of its own.</w:t>
+      </w:r>
+    </w:p>
+    <w:p>
+      <w:pPr>
+        <w:ind w:firstLine="720"/>
+      </w:pPr>
+      <w:r>
+        <w:t>The partnership also sets the study's purpose beyond the two parishes. The Office of Cultural Heritage is concerned with the promotion of the diocese's heritage across KalMaNa — Caloocan, Malabon and Navotas — and SanctiWalk is intended as an instrument of that promotion, beginning in Caloocan, where both pilot parishes and the diocesan cathedral stand.</w:t>
       </w:r>
     </w:p>
     <w:p>
@@ -167,7 +205,7 @@
         <w:ind w:firstLine="720"/>
       </w:pPr>
       <w:r>
-        <w:t>The application carries all thirty-one parishes of the Diocese of Kalookan on an interactive map rendered from vector street data, with each parish at verified coordinates. A user may search for a parish by name, view its position relative to their own, and request walking directions. Routes are computed by a pedestrian routing service and follow actual streets and footpaths; distance and walking time are derived from the routed path. During navigation the map follows the walker, orients itself to their direction of travel, and presents turn-by-turn instructions. A visitation planner allows several parishes to be selected and ordered for a single devotional circuit.</w:t>
+        <w:t>The application carries every parish of the Diocese of Kalookan on an interactive map rendered from vector street data, with each parish at verified coordinates. A user may search for a parish by name, view its position relative to their own, and request walking directions. Routes are computed by a pedestrian routing service and follow actual streets and footpaths; distance and walking time are derived from the routed path. During navigation the map follows the walker, orients itself to their direction of travel, and presents turn-by-turn instructions. A visitation planner allows several parishes to be selected and ordered for a single devotional circuit.</w:t>
       </w:r>
     </w:p>
     <w:p>
@@ -189,12 +227,12 @@
         <w:ind w:firstLine="720"/>
       </w:pPr>
       <w:r>
-        <w:t>Within Mary Help of Christians Parish and San Roque Cathedral Parish, the system identifies designated stations — altars, images, and other significant features — and presents the history and symbolism of each. Recognition is performed by augmented reality: the device camera is pointed at a station, the station is identified, and its interpretation is displayed. Because browser technology cannot anchor content to a physical location once the trigger has left the camera's view, world-tracked augmented reality is delivered by a companion application built on Unity and ARCore, which SanctiWalk launches directly. Station text may also be narrated aloud, so that the interpretation can be heard while the object itself is being looked at.</w:t>
-      </w:r>
-    </w:p>
-    <w:p>
-      <w:pPr>
-        <w:pStyle w:val="Heading3"/>
+        <w:t>Every church in the diocese has a history and something to say about itself, and almost none of it is written down where a visitor standing inside can read it. SanctiWalk gives each parish two ways to say it, which answer two different kinds of visitor.</w:t>
+      </w:r>
+    </w:p>
+    <w:p>
+      <w:pPr>
+        <w:pStyle w:val="Heading4"/>
         <w:spacing w:before="240" w:after="120"/>
       </w:pPr>
       <w:r>
@@ -203,7 +241,7 @@
           <w:color w:val="000000"/>
           <w:sz w:val="24"/>
         </w:rPr>
-        <w:t>Parish information and services</w:t>
+        <w:t>The AR museum: a marked route through the church</w:t>
       </w:r>
     </w:p>
     <w:p>
@@ -211,7 +249,169 @@
         <w:ind w:firstLine="720"/>
       </w:pPr>
       <w:r>
-        <w:t>For each documented parish the application publishes the Mass schedule, the liturgical calendar and feast days, parish announcements, the church's history, the lay ministries open for membership, and the sacraments the parish administers together with their requirements. A daily scripture verse and a guided rosary are included as devotional features. All content is presented in English or Filipino according to a single setting chosen by the reader.</w:t>
+        <w:t>The parish places printed SanctiWalk markers beside the parts of the church it wants understood — the altar, an image, a commemorative space. A pilgrim who finds a marker opens the scanner, and the marker is read by the companion augmented reality application, which then anchors that station's content in the space around them and keeps it there as they move. Walking on to the next marker continues the route, so the church becomes, in effect, a museum whose exhibits are the building's own and whose labels appear only when a visitor asks for them.</w:t>
+      </w:r>
+    </w:p>
+    <w:p>
+      <w:pPr>
+        <w:ind w:firstLine="720"/>
+      </w:pPr>
+      <w:r>
+        <w:t>The route is curated rather than automatic, and that is the point. Each parish decides which parts of its church are stations and what is said about them, in consultation with the Office of Cultural Heritage, so the tour follows the order the parish would itself walk a visitor through. Nothing is placed in a sacred space that the parish has not placed there.</w:t>
+      </w:r>
+    </w:p>
+    <w:p>
+      <w:pPr>
+        <w:ind w:firstLine="720"/>
+      </w:pPr>
+      <w:r>
+        <w:t>World tracking is why this half runs in a separate application built on Unity and ARCore. No browser interface on Android or iOS can keep content anchored to a physical position once the marker has left the camera's view, and a tour that disappears the moment the pilgrim looks up from the marker is not a tour. SanctiWalk launches that application directly and takes the pilgrim back afterwards.</w:t>
+      </w:r>
+    </w:p>
+    <w:p>
+      <w:pPr>
+        <w:pStyle w:val="Heading4"/>
+        <w:spacing w:before="240" w:after="120"/>
+      </w:pPr>
+      <w:r>
+        <w:rPr>
+          <w:rFonts w:ascii="Times New Roman" w:hAnsi="Times New Roman"/>
+          <w:color w:val="000000"/>
+          <w:sz w:val="24"/>
+        </w:rPr>
+        <w:t>The AI scanner: asking about whatever you are looking at</w:t>
+      </w:r>
+    </w:p>
+    <w:p>
+      <w:pPr>
+        <w:ind w:firstLine="720"/>
+      </w:pPr>
+      <w:r>
+        <w:t>A marked route can only cover what the parish anticipated. A visitor who stops in front of an image nobody marked, and wants to know who the saint is, is served by the second facility: they point the camera at it, tap, and the object is identified and explained.</w:t>
+      </w:r>
+    </w:p>
+    <w:p>
+      <w:pPr>
+        <w:ind w:firstLine="720"/>
+      </w:pPr>
+      <w:r>
+        <w:t>The two are deliberately different in kind. The marker route is curated, fixed and authoritative — it says what the parish says. The scanner is open-ended and answers curiosity the parish did not foresee. Where the scanner recognises something that is also a station of the marked route, it gives the parish's own words for it rather than its own.</w:t>
+      </w:r>
+    </w:p>
+    <w:p>
+      <w:pPr>
+        <w:ind w:firstLine="720"/>
+      </w:pPr>
+      <w:r>
+        <w:t>Both may be narrated aloud, so that the interpretation can be heard while the object itself is being looked at. A printed QR code beside a station, and a list of the stations within the application, reach the same text for a visitor whose device cannot run augmented reality at all.</w:t>
+      </w:r>
+    </w:p>
+    <w:p>
+      <w:pPr>
+        <w:pStyle w:val="Heading3"/>
+        <w:spacing w:before="240" w:after="120"/>
+      </w:pPr>
+      <w:r>
+        <w:rPr>
+          <w:rFonts w:ascii="Times New Roman" w:hAnsi="Times New Roman"/>
+          <w:color w:val="000000"/>
+          <w:sz w:val="24"/>
+        </w:rPr>
+        <w:t>Why this is a tour guide system</w:t>
+      </w:r>
+    </w:p>
+    <w:p>
+      <w:pPr>
+        <w:ind w:firstLine="720"/>
+      </w:pPr>
+      <w:r>
+        <w:t>The system carries Mass schedules, announcements and an application process, and a reader meeting those for the first time may ask how they belong under the word "tour guide". They belong because a tour guide has never been only a person who names objects.</w:t>
+      </w:r>
+    </w:p>
+    <w:p>
+      <w:pPr>
+        <w:ind w:firstLine="720"/>
+      </w:pPr>
+      <w:r>
+        <w:t>A guide at a heritage church meets visitors and brings them in; explains what the altar, the images and the architecture mean; tells them when Mass is and what is happening in the parish this week; answers whatever they ask; and, when a visitor wants something the guide cannot give them — to be baptised, to join a ministry — refers them to the parish office. Every module of SanctiWalk corresponds to one of those acts:</w:t>
+      </w:r>
+    </w:p>
+    <w:p>
+      <w:pPr>
+        <w:pStyle w:val="ListBullet"/>
+        <w:spacing w:line="480" w:lineRule="auto"/>
+        <w:jc w:val="both"/>
+      </w:pPr>
+      <w:r>
+        <w:t>Bringing the visitor in is the map and the walking directions. A guide who cannot get you to the church is not guiding.</w:t>
+      </w:r>
+    </w:p>
+    <w:p>
+      <w:pPr>
+        <w:pStyle w:val="ListBullet"/>
+        <w:spacing w:line="480" w:lineRule="auto"/>
+        <w:jc w:val="both"/>
+      </w:pPr>
+      <w:r>
+        <w:t>Explaining what things mean is the marked augmented reality route and the audio narration — the parish's own guided walk through its church, which is as literal a tour as the word allows.</w:t>
+      </w:r>
+    </w:p>
+    <w:p>
+      <w:pPr>
+        <w:pStyle w:val="ListBullet"/>
+        <w:spacing w:line="480" w:lineRule="auto"/>
+        <w:jc w:val="both"/>
+      </w:pPr>
+      <w:r>
+        <w:t>Answering what the guide was not asked to prepare for is the image scanner. A visitor who stops at something off the route and asks "who is this?" is asking a guide a question, and getting an answer.</w:t>
+      </w:r>
+    </w:p>
+    <w:p>
+      <w:pPr>
+        <w:pStyle w:val="ListBullet"/>
+        <w:spacing w:line="480" w:lineRule="auto"/>
+        <w:jc w:val="both"/>
+      </w:pPr>
+      <w:r>
+        <w:t>Telling you what is on is the Mass schedule, the feast days and the announcements.</w:t>
+      </w:r>
+    </w:p>
+    <w:p>
+      <w:pPr>
+        <w:pStyle w:val="ListBullet"/>
+        <w:spacing w:line="480" w:lineRule="auto"/>
+        <w:jc w:val="both"/>
+      </w:pPr>
+      <w:r>
+        <w:t>Answering what you ask is the on-device assistant.</w:t>
+      </w:r>
+    </w:p>
+    <w:p>
+      <w:pPr>
+        <w:pStyle w:val="ListBullet"/>
+        <w:spacing w:line="480" w:lineRule="auto"/>
+        <w:jc w:val="both"/>
+      </w:pPr>
+      <w:r>
+        <w:t>Referring you onward is the ministry and sacrament application, which hands the visitor to the parish office rather than attempting to serve them itself.</w:t>
+      </w:r>
+    </w:p>
+    <w:p>
+      <w:pPr>
+        <w:pStyle w:val="ListBullet"/>
+        <w:spacing w:line="480" w:lineRule="auto"/>
+        <w:jc w:val="both"/>
+      </w:pPr>
+      <w:r>
+        <w:t>The administrative portal is the guide's briefing. It exists so that what the guide says is current and comes from the parish — a tour guide working from a schedule that changed last month is the failure the portal prevents.</w:t>
+      </w:r>
+    </w:p>
+    <w:p>
+      <w:pPr>
+        <w:ind w:firstLine="720"/>
+      </w:pPr>
+      <w:r>
+        <w:t>The term is also the field's own. The literature reviewed here describes systems of this kind as augmented reality smart guide systems and mobile tour guide systems, covering exactly this combination of interpretation, navigation and visitor information. SanctiWalk is a tour guide system in the sense the discipline uses the words, and the parish-side modules are what make the guidance trustworthy rather than a separate product bolted onto it.</w:t>
       </w:r>
     </w:p>
     <w:p>
@@ -324,7 +524,7 @@
         <w:jc w:val="both"/>
       </w:pPr>
       <w:r>
-        <w:t>The religious, historical and cultural significance of the altars, images and architectural features within the two churches is not presented to visitors in any form they can consult on site. Visitors consequently view these objects without understanding what they represent, and the parishes' heritage remains undocumented for those who did not arrive already knowing it.</w:t>
+        <w:t>The heritage of the parishes is recorded but not accessible where it matters. The history of the churches and the meaning of their altars, images and architectural features are held in the diocese's own written accounts and in the knowledge of its clergy and long-standing parishioners, yet none of it reaches a visitor at the moment and in the place where it would mean something. The churches carry no interpretive signage, no printed guide accompanies a visit, and neither parish maintains a guide service. A visitor therefore stands before an object of devotional and historical significance with no means of learning what it represents, and heritage the diocese has taken care to document remains, in practice, invisible to the people who have come to see it.</w:t>
       </w:r>
     </w:p>
     <w:p>
@@ -344,7 +544,7 @@
         <w:jc w:val="both"/>
       </w:pPr>
       <w:r>
-        <w:t>Church administrators have no means of observing how the church is actually used — how many visitors come, at what hours and on which days, and which parts of the church they stop at — which limits their ability to assess visitor flow and to plan around it.</w:t>
+        <w:t>Parish administrators have no means of publishing and keeping current the information visitors depend on. Mass times, feast days, announcements and the requirements of each sacrament are held on noticeboards, in the memory of parish staff, or on social media pages the parish does not control, and there is no way to record that a ministry has stopped accepting members or that a Mass has been suspended. Information therefore reaches visitors out of date, and the parish cannot correct it once it has.</w:t>
       </w:r>
     </w:p>
     <w:p>
@@ -441,7 +641,7 @@
         <w:jc w:val="both"/>
       </w:pPr>
       <w:r>
-        <w:t>To integrate an augmented reality station tour with audio narration that identifies designated sacred objects and areas within the two documented parishes and presents their historical, symbolic and spiritual significance.</w:t>
+        <w:t>To develop a marker-based augmented reality tour, with audio narration, through which each parish presents a curated route of stations within its church and the historical, symbolic and spiritual significance of each.</w:t>
       </w:r>
     </w:p>
     <w:p>
@@ -451,7 +651,7 @@
         <w:jc w:val="both"/>
       </w:pPr>
       <w:r>
-        <w:t>To develop a parish information module that publishes each documented parish's Mass schedule, feast days, announcements, history, lay ministries and sacraments, and presents them in either English or Filipino according to the reader's chosen setting.</w:t>
+        <w:t>To integrate an image recognition scanner through which a visitor may identify a saint, image or religious object they encounter outside the curated route and obtain an explanation of it.</w:t>
       </w:r>
     </w:p>
     <w:p>
@@ -461,7 +661,7 @@
         <w:jc w:val="both"/>
       </w:pPr>
       <w:r>
-        <w:t>To implement an online application and management module through which parishioners may apply for lay ministry membership and book sacraments and follow the status of their requests, and through which parish administrators may review, decide and archive those applications, with access restricted to each administrator's own parish and enforced by server-side security rules.</w:t>
+        <w:t>To develop a parish information module that publishes each documented parish's Mass schedule, feast days, announcements, history, lay ministries and sacraments, and presents them in either English or Filipino according to the reader's chosen setting.</w:t>
       </w:r>
     </w:p>
     <w:p>
@@ -471,7 +671,7 @@
         <w:jc w:val="both"/>
       </w:pPr>
       <w:r>
-        <w:t>To implement an automated reminder and notification facility that alerts users before scheduled Masses, on and before feast days, when a parish publishes an announcement or event, and when a decision is reached on their application, including for parishes other than their own that they have chosen to follow.</w:t>
+        <w:t>To implement an online application and management module through which parishioners may apply for lay ministry membership and book sacraments and follow the status of their requests, and through which parish administrators may review, decide and archive those applications, with access restricted to each administrator's own parish and enforced by server-side security rules.</w:t>
       </w:r>
     </w:p>
     <w:p>
@@ -481,7 +681,7 @@
         <w:jc w:val="both"/>
       </w:pPr>
       <w:r>
-        <w:t>To implement a visitor activity and reporting module that enables parish administrators to review visitor frequency, peak visiting times, the most visited stations, and feature usage for their own parish, without identifying any individual visitor.</w:t>
+        <w:t>To implement an automated reminder and notification facility that alerts users before scheduled Masses, on and before feast days, when a parish publishes an announcement or event, and when a decision is reached on their application, including for parishes other than their own that they have chosen to follow.</w:t>
       </w:r>
     </w:p>
     <w:p>
@@ -491,9 +691,265 @@
         <w:jc w:val="both"/>
       </w:pPr>
       <w:r>
+        <w:t>To implement a parish content and service management module through which administrators maintain their own parish's Mass schedule and feast days, publish and withdraw announcements and events, edit the parish's history and its ministry and sacrament descriptions, and open or close an individual ministry or sacrament to new applications, with these changes taking effect for visitors immediately.</w:t>
+      </w:r>
+    </w:p>
+    <w:p>
+      <w:pPr>
+        <w:pStyle w:val="ListNumber"/>
+        <w:spacing w:line="480" w:lineRule="auto"/>
+        <w:jc w:val="both"/>
+      </w:pPr>
+      <w:r>
         <w:t>To evaluate the acceptability of the developed system with pilgrims, parishioners and parish administrators using the ISO/IEC 25010 software product quality characteristics of functional suitability, performance efficiency, usability, reliability and security.</w:t>
       </w:r>
     </w:p>
+    <w:p>
+      <w:pPr>
+        <w:pStyle w:val="Heading2"/>
+        <w:spacing w:before="240" w:after="120"/>
+      </w:pPr>
+      <w:r>
+        <w:rPr>
+          <w:rFonts w:ascii="Times New Roman" w:hAnsi="Times New Roman"/>
+          <w:color w:val="000000"/>
+          <w:sz w:val="24"/>
+        </w:rPr>
+        <w:t>How the objectives answer the problems</w:t>
+      </w:r>
+    </w:p>
+    <w:p>
+      <w:pPr>
+        <w:ind w:firstLine="720"/>
+      </w:pPr>
+      <w:r>
+        <w:t>Each specific objective addresses a specific problem; two problems are answered by more than one objective, because they are served by more than one facility of the system. The final objective is the evaluation, which tests whether the other seven succeeded.</w:t>
+      </w:r>
+    </w:p>
+    <w:tbl>
+      <w:tblPr>
+        <w:tblStyle w:val="TableGrid"/>
+        <w:tblW w:type="auto" w:w="0"/>
+        <w:tblLook w:firstColumn="1" w:firstRow="1" w:lastColumn="0" w:lastRow="0" w:noHBand="0" w:noVBand="1" w:val="04A0"/>
+      </w:tblPr>
+      <w:tblGrid>
+        <w:gridCol w:w="4320"/>
+        <w:gridCol w:w="4320"/>
+      </w:tblGrid>
+      <w:tr>
+        <w:tc>
+          <w:tcPr>
+            <w:tcW w:type="dxa" w:w="4320"/>
+          </w:tcPr>
+          <w:p>
+            <w:r>
+              <w:rPr>
+                <w:rFonts w:ascii="Times New Roman" w:hAnsi="Times New Roman"/>
+                <w:b/>
+                <w:sz w:val="22"/>
+              </w:rPr>
+              <w:t>Specific Problem</w:t>
+            </w:r>
+          </w:p>
+        </w:tc>
+        <w:tc>
+          <w:tcPr>
+            <w:tcW w:type="dxa" w:w="4320"/>
+          </w:tcPr>
+          <w:p>
+            <w:r>
+              <w:rPr>
+                <w:rFonts w:ascii="Times New Roman" w:hAnsi="Times New Roman"/>
+                <w:b/>
+                <w:sz w:val="22"/>
+              </w:rPr>
+              <w:t>Answered by</w:t>
+            </w:r>
+          </w:p>
+        </w:tc>
+      </w:tr>
+      <w:tr>
+        <w:tc>
+          <w:tcPr>
+            <w:tcW w:type="dxa" w:w="4320"/>
+          </w:tcPr>
+          <w:p>
+            <w:pPr>
+              <w:spacing w:line="240" w:lineRule="auto"/>
+            </w:pPr>
+            <w:r>
+              <w:rPr>
+                <w:rFonts w:ascii="Times New Roman" w:hAnsi="Times New Roman"/>
+                <w:sz w:val="22"/>
+              </w:rPr>
+              <w:t>1. No single source for locating the parishes, reaching them, or knowing their schedules, feast days and announcements</w:t>
+            </w:r>
+          </w:p>
+        </w:tc>
+        <w:tc>
+          <w:tcPr>
+            <w:tcW w:type="dxa" w:w="4320"/>
+          </w:tcPr>
+          <w:p>
+            <w:pPr>
+              <w:spacing w:line="240" w:lineRule="auto"/>
+            </w:pPr>
+            <w:r>
+              <w:rPr>
+                <w:rFonts w:ascii="Times New Roman" w:hAnsi="Times New Roman"/>
+                <w:sz w:val="22"/>
+              </w:rPr>
+              <w:t>Objective 1 (directory and navigation) and Objective 4 (parish information)</w:t>
+            </w:r>
+          </w:p>
+        </w:tc>
+      </w:tr>
+      <w:tr>
+        <w:tc>
+          <w:tcPr>
+            <w:tcW w:type="dxa" w:w="4320"/>
+          </w:tcPr>
+          <w:p>
+            <w:pPr>
+              <w:spacing w:line="240" w:lineRule="auto"/>
+            </w:pPr>
+            <w:r>
+              <w:rPr>
+                <w:rFonts w:ascii="Times New Roman" w:hAnsi="Times New Roman"/>
+                <w:sz w:val="22"/>
+              </w:rPr>
+              <w:t>2. The heritage of the churches is recorded but not accessible to a visitor on site: no signage, no printed guide, no guide service</w:t>
+            </w:r>
+          </w:p>
+        </w:tc>
+        <w:tc>
+          <w:tcPr>
+            <w:tcW w:type="dxa" w:w="4320"/>
+          </w:tcPr>
+          <w:p>
+            <w:pPr>
+              <w:spacing w:line="240" w:lineRule="auto"/>
+            </w:pPr>
+            <w:r>
+              <w:rPr>
+                <w:rFonts w:ascii="Times New Roman" w:hAnsi="Times New Roman"/>
+                <w:sz w:val="22"/>
+              </w:rPr>
+              <w:t>Objective 2 (the marked augmented reality route) and Objective 3 (the image scanner)</w:t>
+            </w:r>
+          </w:p>
+        </w:tc>
+      </w:tr>
+      <w:tr>
+        <w:tc>
+          <w:tcPr>
+            <w:tcW w:type="dxa" w:w="4320"/>
+          </w:tcPr>
+          <w:p>
+            <w:pPr>
+              <w:spacing w:line="240" w:lineRule="auto"/>
+            </w:pPr>
+            <w:r>
+              <w:rPr>
+                <w:rFonts w:ascii="Times New Roman" w:hAnsi="Times New Roman"/>
+                <w:sz w:val="22"/>
+              </w:rPr>
+              <w:t>3. Ministry and sacrament applications are received and tracked manually</w:t>
+            </w:r>
+          </w:p>
+        </w:tc>
+        <w:tc>
+          <w:tcPr>
+            <w:tcW w:type="dxa" w:w="4320"/>
+          </w:tcPr>
+          <w:p>
+            <w:pPr>
+              <w:spacing w:line="240" w:lineRule="auto"/>
+            </w:pPr>
+            <w:r>
+              <w:rPr>
+                <w:rFonts w:ascii="Times New Roman" w:hAnsi="Times New Roman"/>
+                <w:sz w:val="22"/>
+              </w:rPr>
+              <w:t>Objective 5 (online application and management)</w:t>
+            </w:r>
+          </w:p>
+        </w:tc>
+      </w:tr>
+      <w:tr>
+        <w:tc>
+          <w:tcPr>
+            <w:tcW w:type="dxa" w:w="4320"/>
+          </w:tcPr>
+          <w:p>
+            <w:pPr>
+              <w:spacing w:line="240" w:lineRule="auto"/>
+            </w:pPr>
+            <w:r>
+              <w:rPr>
+                <w:rFonts w:ascii="Times New Roman" w:hAnsi="Times New Roman"/>
+                <w:sz w:val="22"/>
+              </w:rPr>
+              <w:t>4. Administrators cannot publish or keep current the information visitors depend on, nor record that a ministry or a Mass is unavailable</w:t>
+            </w:r>
+          </w:p>
+        </w:tc>
+        <w:tc>
+          <w:tcPr>
+            <w:tcW w:type="dxa" w:w="4320"/>
+          </w:tcPr>
+          <w:p>
+            <w:pPr>
+              <w:spacing w:line="240" w:lineRule="auto"/>
+            </w:pPr>
+            <w:r>
+              <w:rPr>
+                <w:rFonts w:ascii="Times New Roman" w:hAnsi="Times New Roman"/>
+                <w:sz w:val="22"/>
+              </w:rPr>
+              <w:t>Objective 7 (parish content and service management)</w:t>
+            </w:r>
+          </w:p>
+        </w:tc>
+      </w:tr>
+      <w:tr>
+        <w:tc>
+          <w:tcPr>
+            <w:tcW w:type="dxa" w:w="4320"/>
+          </w:tcPr>
+          <w:p>
+            <w:pPr>
+              <w:spacing w:line="240" w:lineRule="auto"/>
+            </w:pPr>
+            <w:r>
+              <w:rPr>
+                <w:rFonts w:ascii="Times New Roman" w:hAnsi="Times New Roman"/>
+                <w:sz w:val="22"/>
+              </w:rPr>
+              <w:t>5. No means of notifying parishioners of Masses, feast days, announcements or decisions</w:t>
+            </w:r>
+          </w:p>
+        </w:tc>
+        <w:tc>
+          <w:tcPr>
+            <w:tcW w:type="dxa" w:w="4320"/>
+          </w:tcPr>
+          <w:p>
+            <w:pPr>
+              <w:spacing w:line="240" w:lineRule="auto"/>
+            </w:pPr>
+            <w:r>
+              <w:rPr>
+                <w:rFonts w:ascii="Times New Roman" w:hAnsi="Times New Roman"/>
+                <w:sz w:val="22"/>
+              </w:rPr>
+              <w:t>Objective 6 (reminders and notifications)</w:t>
+            </w:r>
+          </w:p>
+        </w:tc>
+      </w:tr>
+    </w:tbl>
+    <w:p/>
     <w:p>
       <w:pPr>
         <w:ind w:left="720"/>
@@ -549,10 +1005,80 @@
     </w:p>
     <w:p>
       <w:pPr>
+        <w:pStyle w:val="Heading3"/>
+        <w:spacing w:before="240" w:after="120"/>
+      </w:pPr>
+      <w:r>
+        <w:rPr>
+          <w:rFonts w:ascii="Times New Roman" w:hAnsi="Times New Roman"/>
+          <w:color w:val="000000"/>
+          <w:sz w:val="24"/>
+        </w:rPr>
+        <w:t>Delimitation: why two parishes of thirty-one</w:t>
+      </w:r>
+    </w:p>
+    <w:p>
+      <w:pPr>
         <w:ind w:firstLine="720"/>
       </w:pPr>
       <w:r>
-        <w:t>Implementation across the whole Diocese of Kalookan was the researchers' original intention and remains the intended direction of the system. On the advice of the client, however, the scope of this study was delimited to two parishes implemented in full. Collecting and verifying complete content for thirty-one parishes — the station tours, histories, Mass schedules, and ministry and sacrament requirements, each confirmed with the parish concerned — could not be completed within the project period, and the client directed that a smaller number be implemented completely rather than a larger number implemented partially. The system was nevertheless designed so that extension to a further parish requires content and an administrator account rather than a change to the software: parish content is stored per parish, and administrator access is already bounded per parish.</w:t>
+        <w:t>Implementation across the whole Diocese of Kalookan is the intended direction of the system and the purpose for which the partnership was formed. The study is nevertheless delimited to two parishes implemented in full, on the advice of the client and for four reasons that are methodological rather than merely practical.</w:t>
+      </w:r>
+    </w:p>
+    <w:p>
+      <w:pPr>
+        <w:pStyle w:val="ListNumber"/>
+        <w:spacing w:line="480" w:lineRule="auto"/>
+        <w:jc w:val="both"/>
+      </w:pPr>
+      <w:r>
+        <w:t>Accuracy is a requirement of this system, not a preference. A tour guide that misnames an image, misdates a church or invents the meaning of an altar damages the heritage it exists to serve, and it does so with the authority of print. Every station description, history and sacramental requirement in SanctiWalk is therefore confirmed with the parish concerned and against the diocese's own historical record. That verification, not the software, is what cannot be done thirty-one times within a capstone period.</w:t>
+      </w:r>
+    </w:p>
+    <w:p>
+      <w:pPr>
+        <w:pStyle w:val="ListNumber"/>
+        <w:spacing w:line="480" w:lineRule="auto"/>
+        <w:jc w:val="both"/>
+      </w:pPr>
+      <w:r>
+        <w:t>Depth is what makes a tour guide a tour guide. Thirty-one parishes with nothing to say about any of them would be a directory. Two parishes with a complete station tour, history, schedule and service information demonstrate the thing the study claims to have built.</w:t>
+      </w:r>
+    </w:p>
+    <w:p>
+      <w:pPr>
+        <w:pStyle w:val="ListNumber"/>
+        <w:spacing w:line="480" w:lineRule="auto"/>
+        <w:jc w:val="both"/>
+      </w:pPr>
+      <w:r>
+        <w:t>A bounded pilot is what makes the evaluation meaningful. The system is assessed by pilgrims, parishioners and administrators who have used it at a parish whose content is complete. An evaluation spread across parishes of uneven content would measure the content, not the system.</w:t>
+      </w:r>
+    </w:p>
+    <w:p>
+      <w:pPr>
+        <w:pStyle w:val="ListNumber"/>
+        <w:spacing w:line="480" w:lineRule="auto"/>
+        <w:jc w:val="both"/>
+      </w:pPr>
+      <w:r>
+        <w:t>Proving it in two is the precondition for distributing it to the rest. The diocese does not need a system designed for the whole of it and demonstrated at none of it; it needs one shown to work, which the remaining parishes can adopt as their content is prepared.</w:t>
+      </w:r>
+    </w:p>
+    <w:p>
+      <w:pPr>
+        <w:ind w:firstLine="720"/>
+      </w:pPr>
+      <w:r>
+        <w:t>The architecture was built for that extension rather than retrofitted for it, and the claim is testable: every parish of the diocese is already present in the system as located, searchable and navigable destinations; parish content is stored per parish rather than written into the program; and administrator access is already bounded to a single parish and enforced at the database. Admitting a third parish therefore requires verified content and an administrator account. It does not require a change to the software.</w:t>
+      </w:r>
+    </w:p>
+    <w:p>
+      <w:pPr>
+        <w:ind w:firstLine="720"/>
+      </w:pPr>
+      <w:r>
+        <w:t>The two were selected with the Office of Cultural Heritage. Both stand in Caloocan, the first of the three cities of KalMaNa in which the diocese is promoting its heritage, and one of them, San Roque Cathedral Parish, is the seat of the diocese itself.</w:t>
       </w:r>
     </w:p>
     <w:p>
@@ -660,7 +1186,7 @@
         <w:jc w:val="both"/>
       </w:pPr>
       <w:r>
-        <w:t>Augmented reality station tour module — station recognition through the device camera and the presentation of each station's interpretation, with audio narration.</w:t>
+        <w:t>Augmented reality tour module — the parish's curated route of marked stations, read through the device camera and presented as world-anchored content by the companion application, with audio narration and a printed QR code and in-app station list as alternatives.</w:t>
       </w:r>
     </w:p>
     <w:p>
@@ -670,7 +1196,7 @@
         <w:jc w:val="both"/>
       </w:pPr>
       <w:r>
-        <w:t>Parish information module — Mass schedules, feast days, church history, lay ministry descriptions, and sacrament requirements, in English or Filipino.</w:t>
+        <w:t>Image scanner module — identification and explanation of a saint, image or religious object the visitor points the camera at, for anything outside the curated route.</w:t>
       </w:r>
     </w:p>
     <w:p>
@@ -680,7 +1206,7 @@
         <w:jc w:val="both"/>
       </w:pPr>
       <w:r>
-        <w:t>Application module — ministry membership applications and sacrament bookings, and the applicant's view of their own submitted requests and their status.</w:t>
+        <w:t>Parish information module — Mass schedules, feast days, church history, lay ministry descriptions, and sacrament requirements, in English or Filipino.</w:t>
       </w:r>
     </w:p>
     <w:p>
@@ -690,7 +1216,7 @@
         <w:jc w:val="both"/>
       </w:pPr>
       <w:r>
-        <w:t>Notification module — Mass, feast day, announcement, event and application reminders, including for followed parishes.</w:t>
+        <w:t>Application module — ministry membership applications and sacrament bookings, and the applicant's view of their own submitted requests and their status.</w:t>
       </w:r>
     </w:p>
     <w:p>
@@ -700,7 +1226,7 @@
         <w:jc w:val="both"/>
       </w:pPr>
       <w:r>
-        <w:t>Devotional module — the daily scripture verse and the guided rosary.</w:t>
+        <w:t>Notification module — Mass, feast day, announcement, event and application reminders, including for followed parishes.</w:t>
       </w:r>
     </w:p>
     <w:p>
@@ -710,15 +1236,7 @@
         <w:jc w:val="both"/>
       </w:pPr>
       <w:r>
-        <w:t>Assistance module — an on-device guide that answers questions about the parish's schedules, sacraments, ministries and location in English, Filipino or a mixture of the two, and that offers to open the relevant part of the application rather than navigating without being asked.</w:t>
-      </w:r>
-    </w:p>
-    <w:p>
-      <w:pPr>
-        <w:ind w:firstLine="720"/>
-      </w:pPr>
-      <w:r>
-        <w:t>The administrative portal consists of the following modules:</w:t>
+        <w:t>Devotional module — the daily scripture verse and the guided rosary.</w:t>
       </w:r>
     </w:p>
     <w:p>
@@ -728,7 +1246,15 @@
         <w:jc w:val="both"/>
       </w:pPr>
       <w:r>
-        <w:t>Dashboard module — the counts of applications outstanding, by kind and by status, for the administrator's own parish.</w:t>
+        <w:t>Assistance module — an on-device guide that answers questions about the parish's schedules, sacraments, ministries and location in English, Filipino or a mixture of the two, and that offers to open the relevant part of the application rather than navigating without being asked.</w:t>
+      </w:r>
+    </w:p>
+    <w:p>
+      <w:pPr>
+        <w:ind w:firstLine="720"/>
+      </w:pPr>
+      <w:r>
+        <w:t>The administrative portal consists of the following modules:</w:t>
       </w:r>
     </w:p>
     <w:p>
@@ -738,7 +1264,7 @@
         <w:jc w:val="both"/>
       </w:pPr>
       <w:r>
-        <w:t>Applications module — the review, decision and archiving of ministry and sacrament applications, with filtering by period, kind, type and status, and free-text search.</w:t>
+        <w:t>Dashboard module — the counts of applications outstanding, by kind and by status, for the administrator's own parish.</w:t>
       </w:r>
     </w:p>
     <w:p>
@@ -748,7 +1274,7 @@
         <w:jc w:val="both"/>
       </w:pPr>
       <w:r>
-        <w:t>Announcements module — the publication and withdrawal of parish announcements and events.</w:t>
+        <w:t>Applications module — the review, decision and archiving of ministry and sacrament applications, with filtering by period, kind, type and status, and free-text search.</w:t>
       </w:r>
     </w:p>
     <w:p>
@@ -758,7 +1284,7 @@
         <w:jc w:val="both"/>
       </w:pPr>
       <w:r>
-        <w:t>Mass schedule and feast day module — the maintenance of the parish's Mass times, including the suspension of individual Masses, and of the parish's feast days.</w:t>
+        <w:t>Announcements module — the publication and withdrawal of parish announcements and events.</w:t>
       </w:r>
     </w:p>
     <w:p>
@@ -768,7 +1294,7 @@
         <w:jc w:val="both"/>
       </w:pPr>
       <w:r>
-        <w:t>Parish content module — the maintenance of the parish's own history and of its ministry and sacrament descriptions.</w:t>
+        <w:t>Mass schedule and feast day module — the maintenance of the parish's Mass times, including the suspension of individual Masses, and of the parish's feast days.</w:t>
       </w:r>
     </w:p>
     <w:p>
@@ -778,7 +1304,7 @@
         <w:jc w:val="both"/>
       </w:pPr>
       <w:r>
-        <w:t>Availability module — the opening and closing of individual ministries and sacraments to new applications.</w:t>
+        <w:t>Parish content module — the maintenance of the parish's own history and of its ministry and sacrament descriptions.</w:t>
       </w:r>
     </w:p>
     <w:p>
@@ -788,7 +1314,7 @@
         <w:jc w:val="both"/>
       </w:pPr>
       <w:r>
-        <w:t>Visitor activity module — visitor frequency over the preceding fortnight, activity by hour of the day and by day of the week, the most visited stations, and the usage of each recorded feature, for the administrator's own parish.</w:t>
+        <w:t>Availability module — the opening and closing of individual ministries and sacraments to new applications.</w:t>
       </w:r>
     </w:p>
     <w:p>
@@ -850,7 +1376,7 @@
         <w:jc w:val="both"/>
       </w:pPr>
       <w:r>
-        <w:t>The system does not provide navigation inside the church building. Satellite positioning is not reliable indoors, and the study did not extend to the indoor positioning infrastructure that would be required. Guidance within the church is by station tour order, not by directional wayfinding.</w:t>
+        <w:t>The augmented reality tour requires the parish to have printed and placed the markers. It cannot be used in a part of the church the parish has not marked, and in an unmarked parish it cannot be used at all.</w:t>
       </w:r>
     </w:p>
     <w:p>
@@ -860,7 +1386,27 @@
         <w:jc w:val="both"/>
       </w:pPr>
       <w:r>
-        <w:t>Visitor reporting counts signed-in users only. A pilgrim who browses without an account is not recorded, so the figures are a floor rather than a count of everyone who visited. No individual is identified in any report: the user identifier is used to count distinct people and is never displayed.</w:t>
+        <w:t>The image scanner requires an internet connection and the recognition service. Its accuracy is bounded by that service, and it is restricted by a shared daily allowance; the marked route and the station list do not depend on it.</w:t>
+      </w:r>
+    </w:p>
+    <w:p>
+      <w:pPr>
+        <w:pStyle w:val="ListBullet"/>
+        <w:spacing w:line="480" w:lineRule="auto"/>
+        <w:jc w:val="both"/>
+      </w:pPr>
+      <w:r>
+        <w:t>The system does not provide navigation inside the church building. Satellite positioning is not reliable indoors, and the study did not extend to the indoor positioning infrastructure that would be required. Guidance within the church is by station tour order, not by directional wayfinding.</w:t>
+      </w:r>
+    </w:p>
+    <w:p>
+      <w:pPr>
+        <w:pStyle w:val="ListBullet"/>
+        <w:spacing w:line="480" w:lineRule="auto"/>
+        <w:jc w:val="both"/>
+      </w:pPr>
+      <w:r>
+        <w:t>The system does not track visitors and reports no visitor analytics. Counts of who came, when, and where they stopped were considered and set aside: they answer no question the parish office actually asks, and recording the movements of worshippers within a church would make the parish a personal information controller for behavioural data under Republic Act No. 10173 without a purpose that justified it. The administrative portal reports the parish's own applications, which are submitted deliberately by identified people for a stated purpose.</w:t>
       </w:r>
     </w:p>
     <w:p>
@@ -1270,7 +1816,7 @@
         <w:jc w:val="both"/>
       </w:pPr>
       <w:r>
-        <w:t>The system shall display the thirty-one parishes of the Diocese of Kalookan on an interactive street map at their verified coordinates.</w:t>
+        <w:t>The system shall display every parish of the Diocese of Kalookan on an interactive street map at its verified coordinates.</w:t>
       </w:r>
     </w:p>
     <w:p>
@@ -1344,7 +1890,7 @@
           <w:color w:val="000000"/>
           <w:sz w:val="24"/>
         </w:rPr>
-        <w:t>Augmented Reality Station Tour Module</w:t>
+        <w:t>Augmented Reality Tour Module</w:t>
       </w:r>
     </w:p>
     <w:p>
@@ -1354,7 +1900,7 @@
         <w:jc w:val="both"/>
       </w:pPr>
       <w:r>
-        <w:t>The system shall recognise designated stations within the documented parishes through the device camera.</w:t>
+        <w:t>The system shall read a printed SanctiWalk marker placed by the parish beside a station of its curated route.</w:t>
       </w:r>
     </w:p>
     <w:p>
@@ -1364,7 +1910,7 @@
         <w:jc w:val="both"/>
       </w:pPr>
       <w:r>
-        <w:t>The system shall display the historical, symbolic and spiritual interpretation of a recognised station.</w:t>
+        <w:t>The system shall present the station's content anchored in the space around the visitor, and shall keep it anchored once the marker has left the camera's view.</w:t>
       </w:r>
     </w:p>
     <w:p>
@@ -1374,7 +1920,7 @@
         <w:jc w:val="both"/>
       </w:pPr>
       <w:r>
-        <w:t>The system shall narrate station text aloud on request.</w:t>
+        <w:t>The system shall lead the visitor from one station to the next along the route the parish has defined.</w:t>
       </w:r>
     </w:p>
     <w:p>
@@ -1384,7 +1930,81 @@
         <w:jc w:val="both"/>
       </w:pPr>
       <w:r>
-        <w:t>The system shall launch the companion augmented reality application for world-tracked content, and shall inform the user when the device cannot run it.</w:t>
+        <w:t>The system shall state which of the three conditions holds — no marker found yet, a marker being read, or the tour running — rather than offering a tour that cannot start where the visitor is standing.</w:t>
+      </w:r>
+    </w:p>
+    <w:p>
+      <w:pPr>
+        <w:pStyle w:val="ListBullet"/>
+        <w:spacing w:line="480" w:lineRule="auto"/>
+        <w:jc w:val="both"/>
+      </w:pPr>
+      <w:r>
+        <w:t>The system shall narrate station text aloud on request.</w:t>
+      </w:r>
+    </w:p>
+    <w:p>
+      <w:pPr>
+        <w:pStyle w:val="ListBullet"/>
+        <w:spacing w:line="480" w:lineRule="auto"/>
+        <w:jc w:val="both"/>
+      </w:pPr>
+      <w:r>
+        <w:t>The system shall provide a printed QR code and an in-application list of stations as alternative routes to the same content.</w:t>
+      </w:r>
+    </w:p>
+    <w:p>
+      <w:pPr>
+        <w:pStyle w:val="ListBullet"/>
+        <w:spacing w:line="480" w:lineRule="auto"/>
+        <w:jc w:val="both"/>
+      </w:pPr>
+      <w:r>
+        <w:t>The system shall inform the visitor when their device cannot run augmented reality, rather than offering a feature that will not open.</w:t>
+      </w:r>
+    </w:p>
+    <w:p>
+      <w:pPr>
+        <w:pStyle w:val="Heading4"/>
+        <w:spacing w:before="240" w:after="120"/>
+      </w:pPr>
+      <w:r>
+        <w:rPr>
+          <w:rFonts w:ascii="Times New Roman" w:hAnsi="Times New Roman"/>
+          <w:color w:val="000000"/>
+          <w:sz w:val="24"/>
+        </w:rPr>
+        <w:t>Image Scanner Module</w:t>
+      </w:r>
+    </w:p>
+    <w:p>
+      <w:pPr>
+        <w:pStyle w:val="ListBullet"/>
+        <w:spacing w:line="480" w:lineRule="auto"/>
+        <w:jc w:val="both"/>
+      </w:pPr>
+      <w:r>
+        <w:t>The system shall identify a saint, image or religious object the visitor points the device camera at, and present an explanation of it.</w:t>
+      </w:r>
+    </w:p>
+    <w:p>
+      <w:pPr>
+        <w:pStyle w:val="ListBullet"/>
+        <w:spacing w:line="480" w:lineRule="auto"/>
+        <w:jc w:val="both"/>
+      </w:pPr>
+      <w:r>
+        <w:t>The system shall give the parish's own words for anything it recognises that is also a station of the curated route.</w:t>
+      </w:r>
+    </w:p>
+    <w:p>
+      <w:pPr>
+        <w:pStyle w:val="ListBullet"/>
+        <w:spacing w:line="480" w:lineRule="auto"/>
+        <w:jc w:val="both"/>
+      </w:pPr>
+      <w:r>
+        <w:t>The system shall say that it does not know, rather than offer a description it cannot support, when the object is not recognised.</w:t>
       </w:r>
     </w:p>
     <w:p>
@@ -2686,6 +3306,82 @@
           <w:color w:val="000000"/>
           <w:sz w:val="24"/>
         </w:rPr>
+        <w:t>"Why is it called a tour guide when it does applications and admin?"</w:t>
+      </w:r>
+    </w:p>
+    <w:p>
+      <w:pPr>
+        <w:ind w:firstLine="720"/>
+      </w:pPr>
+      <w:r>
+        <w:t>Answer with what a tour guide actually does, not with a defence of the extra features. A guide at a heritage church brings visitors in, explains what they are looking at, tells them when Mass is, answers their questions, and refers them to the parish office for anything the guide cannot give them. Name the five and point at the module for each: the map brings them in, the AR station tour explains, the schedule and announcements say what is on, the assistant answers, and the application refers them onward.</w:t>
+      </w:r>
+    </w:p>
+    <w:p>
+      <w:pPr>
+        <w:ind w:firstLine="720"/>
+      </w:pPr>
+      <w:r>
+        <w:t>Then take the administrative portal head on, because that is the part that looks least like a tour guide and is in fact the part that makes it one. A guide is only as good as the briefing they are working from. The portal is how the parish keeps the guide current: it is the reason the Mass time on screen is this month's and the reason a ministry that has stopped accepting members says so. Without it the system would be a leaflet that goes stale, which is the problem the study set out to solve.</w:t>
+      </w:r>
+    </w:p>
+    <w:p>
+      <w:pPr>
+        <w:ind w:firstLine="720"/>
+      </w:pPr>
+      <w:r>
+        <w:t>If pressed on vocabulary, the term is the field's own. The reviewed literature calls these augmented reality smart guide systems and mobile tour guide systems, and means by them exactly this combination of interpretation, navigation and visitor information. The title is not a loose fit; it is the discipline's name for the thing.</w:t>
+      </w:r>
+    </w:p>
+    <w:p>
+      <w:pPr>
+        <w:pStyle w:val="Heading2"/>
+        <w:spacing w:before="240" w:after="120"/>
+      </w:pPr>
+      <w:r>
+        <w:rPr>
+          <w:rFonts w:ascii="Times New Roman" w:hAnsi="Times New Roman"/>
+          <w:color w:val="000000"/>
+          <w:sz w:val="24"/>
+        </w:rPr>
+        <w:t>"Why build for one place instead of something general?"</w:t>
+      </w:r>
+    </w:p>
+    <w:p>
+      <w:pPr>
+        <w:ind w:firstLine="720"/>
+      </w:pPr>
+      <w:r>
+        <w:t>Because the value is in the specificity, and a general product would have none of it. What makes SanctiWalk worth using is that it knows this altar, this parish's Mass times, this diocese's history — verified with the Office of Cultural Heritage and against AGOS. A generic church-tour application with no content is an empty frame, and the research contribution would be nil.</w:t>
+      </w:r>
+    </w:p>
+    <w:p>
+      <w:pPr>
+        <w:ind w:firstLine="720"/>
+      </w:pPr>
+      <w:r>
+        <w:t>Say plainly who the work was done with: Rev. Fr. Paul Nicklaus Woo, Director of Cultural Heritage of the Diocese of Kalookan, and the writer of AGOS, the diocese's own history of its parishes. That partnership is what distinguishes this from a student project that scraped its content, and it is also the answer to any question about where the heritage text came from.</w:t>
+      </w:r>
+    </w:p>
+    <w:p>
+      <w:pPr>
+        <w:ind w:firstLine="720"/>
+      </w:pPr>
+      <w:r>
+        <w:t>Then give the purpose beyond the two parishes: the system is an instrument for promoting the heritage and tourism of KalMaNa — Caloocan, Malabon and Navotas — beginning in Caloocan, where both pilot parishes and the cathedral stand. It is built for one diocese on purpose, and designed to spread within it.</w:t>
+      </w:r>
+    </w:p>
+    <w:p>
+      <w:pPr>
+        <w:pStyle w:val="Heading2"/>
+        <w:spacing w:before="240" w:after="120"/>
+      </w:pPr>
+      <w:r>
+        <w:rPr>
+          <w:rFonts w:ascii="Times New Roman" w:hAnsi="Times New Roman"/>
+          <w:color w:val="000000"/>
+          <w:sz w:val="24"/>
+        </w:rPr>
         <w:t>"Why not just use a Facebook page? Facebook is more reliable."</w:t>
       </w:r>
     </w:p>
@@ -2774,7 +3470,23 @@
         <w:ind w:firstLine="720"/>
       </w:pPr>
       <w:r>
-        <w:t>This was the client's decision and should be presented as such, not as a limitation the researchers chose. The intention was diocese-wide implementation; the parish advised that collecting and verifying complete content for thirty-one parishes — the station tours, the histories, the Mass schedules, the ministry and sacrament requirements, each confirmed with the parish concerned — could not be completed within the project period, and directed that the system be fully implemented for a smaller number first. Mary Help of Christians Parish and San Roque Cathedral Parish were selected accordingly.</w:t>
+        <w:t>Lead with accuracy, not with time. The binding constraint is not how long the software takes to write; it is that every station description, history and requirement must be confirmed with the parish and against the diocese's own record. A tour guide that misnames an image or invents a founding date damages the heritage it exists to serve. Thirty-one parishes cannot be verified to that standard in a capstone period, and the honest choice is two done properly rather than thirty-one done approximately.</w:t>
+      </w:r>
+    </w:p>
+    <w:p>
+      <w:pPr>
+        <w:ind w:firstLine="720"/>
+      </w:pPr>
+      <w:r>
+        <w:t>Then make the extension concrete, because "it can be scaled later" is what every project says. All thirty-one parishes are already located, searchable and navigable in the system today; content is stored per parish rather than written into the program; administrator access is already bounded per parish and enforced at the database. Adding a third parish needs verified content and an account, not a code change — and you can demonstrate the first part by searching for any of the other parishes on the map in front of the panel.</w:t>
+      </w:r>
+    </w:p>
+    <w:p>
+      <w:pPr>
+        <w:ind w:firstLine="720"/>
+      </w:pPr>
+      <w:r>
+        <w:t>This was also the client's decision and should be presented as such, not as a limitation the researchers chose. The intention was diocese-wide implementation; the parish advised that collecting and verifying complete content for thirty-one parishes — the station tours, the histories, the Mass schedules, the ministry and sacrament requirements, each confirmed with the parish concerned — could not be completed within the project period, and directed that the system be fully implemented for a smaller number first. Mary Help of Christians Parish and San Roque Cathedral Parish were selected accordingly.</w:t>
       </w:r>
     </w:p>
     <w:p>
@@ -2804,7 +3516,7 @@
         <w:ind w:firstLine="720"/>
       </w:pPr>
       <w:r>
-        <w:t>It is built. Open the Visitor activity screen in the parish portal and show it: visitor frequency over the last fortnight, activity by hour and by weekday, the most visited stations by name, and the usage of each recorded feature.</w:t>
+        <w:t>It was removed on the client's determination, and say so plainly rather than apologising for it. Counts of how many visitors came and at what hour answer no question the parish office actually asks. What the office needs is the ability to post an announcement, keep the Mass schedule right, say that a ministry has stopped accepting members, and see what is waiting for a decision. That is what the portal does, and it is now Objective 7 in place of the analytics.</w:t>
       </w:r>
     </w:p>
     <w:p>
@@ -2812,7 +3524,7 @@
         <w:ind w:firstLine="720"/>
       </w:pPr>
       <w:r>
-        <w:t>Be ready for the follow-up, which is the privacy one. The answer is that the reports count signed-in users only, that no individual is named anywhere in them, and that the user identifier is used solely to count distinct people — "how many came on Sunday" is answered, "who came on Sunday" is not. Both points are covered by tests, one of which asserts that a user identifier handed to the screen is never rendered.</w:t>
+        <w:t>If pressed, add the second reason, which is the stronger one: recording where worshippers walk inside a church would make the parish a personal information controller for behavioural data under the Data Privacy Act, and the researchers were not in a position to obtain that consent on the parish's behalf for a measurement nobody had asked for. Choosing not to collect data is a defensible engineering decision, and it should be presented as one.</w:t>
       </w:r>
     </w:p>
     <w:p>
@@ -2914,7 +3626,35 @@
         <w:ind w:left="720" w:hanging="720"/>
       </w:pPr>
       <w:r>
+        <w:t>Woo, P. N. (2026). [Interview / consultation on the heritage content of Mary Help of Christians Parish and San Roque Cathedral Parish]. Office of Cultural Heritage, Diocese of Kalookan.</w:t>
+      </w:r>
+    </w:p>
+    <w:p>
+      <w:pPr>
+        <w:ind w:left="720" w:hanging="720"/>
+      </w:pPr>
+      <w:r>
         <w:t>Zhao, P., Yoo, I., Lavoie, J., Lavoie, B. J., &amp; Simoes, E. (2017). Web-based medical appointment systems: A systematic review. Journal of Medical Internet Research, 19(4), e134. https://doi.org/10.2196/jmir.6747</w:t>
+      </w:r>
+    </w:p>
+    <w:p>
+      <w:pPr>
+        <w:ind w:left="720" w:hanging="720"/>
+      </w:pPr>
+      <w:r>
+        <w:t>[AUTHOR SURNAME, Initials]. (year). AGOS: [full subtitle]. [Publisher]. — the diocese's history of the parishes and communities of Caloocan, Malabon and Navotas, and the source against which the heritage content of this system was verified.</w:t>
+      </w:r>
+    </w:p>
+    <w:p>
+      <w:pPr>
+        <w:ind w:left="720"/>
+      </w:pPr>
+      <w:r>
+        <w:rPr>
+          <w:i/>
+          <w:color w:val="C00000"/>
+        </w:rPr>
+        <w:t>[TO SUPPLY] The two bracketed entries are yours to complete and I have deliberately not guessed at them. For AGOS: give the writer's name, the year and the publisher, and confirm whether you mean the 2024 book on the parishes of the diocese or the diocesan periodical of the same name — both exist and a panelist from the diocese will know the difference. For Fr. Woo: use your programme's format for a personal communication or resource person, give the actual date you consulted him, and put his signed certification in the appendix if you have one. A named diocesan authority behind your content is among the strongest things in this paper; it is worth citing exactly.</w:t>
       </w:r>
     </w:p>
     <w:p>

</xml_diff>